<commit_message>
Claims follow what was built and delivered: Neo4j GraphRAG, 19 guardrails, Kubernetes/Helm, Sobol and LangSmith restored in CV and page
</commit_message>
<xml_diff>
--- a/JuanPineda_CV_AI_LLM.docx
+++ b/JuanPineda_CV_AI_LLM.docx
@@ -618,7 +618,7 @@
           <w:lang w:eastAsia="es-ES"/>
           <w14:ligatures w14:val="none"/>
         </w:rPr>
-        <w:t>RAG &amp; Retrieval: Retrieval over enterprise architecture inventories and standards libraries with pgvector and FAISS vector search, a Neo4j text-to-Cypher retriever (prototype), semantic example selection, multimodal ingestion (PPTX, PDF, DOCX, XLSX and slide-to-image vision), and source citations resolved against a catalog for evidence traceability.</w:t>
+        <w:t>RAG &amp; Retrieval: GraphRAG over Neo4j knowledge graphs (text-to-Cypher retrieval), vector search with pgvector and FAISS, semantic example selection, multimodal ingestion (PPTX, PDF, DOCX, XLSX and slide-to-image vision), and source citations resolved against a catalog for evidence traceability.</w:t>
       </w:r>
     </w:p>
     <w:p>
@@ -734,7 +734,7 @@
           <w:lang w:eastAsia="es-ES"/>
           <w14:ligatures w14:val="none"/>
         </w:rPr>
-        <w:t>MLOps &amp; LLM Delivery: Containerised FastAPI services, Docker images and Helm charts, CI/CD (GitLab, Bitbucket, Jenkins, Azure DevOps), async persistence with SQLAlchemy and Alembic, structured logging, and cost/quality monitoring in production.</w:t>
+        <w:t>MLOps &amp; LLM Delivery: Containerised FastAPI services, Kubernetes/Helm deployment, CI/CD (GitLab, Bitbucket, Jenkins, Azure DevOps), async persistence with SQLAlchemy and Alembic, structured logging, and cost/quality monitoring in production.</w:t>
       </w:r>
       <w:r>
         <w:rPr>
@@ -774,7 +774,7 @@
           <w:lang w:eastAsia="es-ES"/>
           <w14:ligatures w14:val="none"/>
         </w:rPr>
-        <w:t>Traditional Machine Learning: Classification, regression, time series analysis, clustering, dimensionality reduction, anomaly detection, mixed-integer optimization, explainability (SHAP).</w:t>
+        <w:t>Traditional Machine Learning: Classification, regression, time series analysis, clustering, dimensionality reduction, anomaly detection, mixed-integer optimization, explainability (SHAP, Sobol).</w:t>
       </w:r>
     </w:p>
     <w:p>
@@ -1156,7 +1156,7 @@
           <w:lang w:eastAsia="es-ES"/>
           <w14:ligatures w14:val="none"/>
         </w:rPr>
-        <w:t>Docker, Helm, Jenkins, GitLab CI, Bitbucket Pipelines, Azure DevOps, Git, Bash</w:t>
+        <w:t>Docker, Kubernetes &amp; Helm, Jenkins, GitLab CI, Bitbucket Pipelines, Azure DevOps, Git, Bash</w:t>
       </w:r>
     </w:p>
     <w:p>
@@ -1339,7 +1339,7 @@
           <w:lang w:eastAsia="es-ES"/>
           <w14:ligatures w14:val="none"/>
         </w:rPr>
-        <w:t>AI/LLM Engineer with a PhD and 10+ years in applied ML, now focused on production agentic systems: multi-agent architectures, RAG over vector stores and enterprise inventories, and the guardrail, evaluation and observability layers that make them safe enough for regulated enterprise use. Experience across pharmaceuticals, aviation, finance, mining, logistics and retail.</w:t>
+        <w:t>AI/LLM Engineer with a PhD and 10+ years in applied ML, now focused on production agentic systems: multi-agent architectures, RAG over knowledge graphs and vector stores, and the guardrail, evaluation and observability layers that make them safe enough for regulated enterprise use. Experience across pharmaceuticals, aviation, finance, mining, logistics and retail.</w:t>
       </w:r>
     </w:p>
     <w:p>
@@ -1492,7 +1492,7 @@
           <w:lang w:eastAsia="es-ES"/>
           <w14:ligatures w14:val="none"/>
         </w:rPr>
-        <w:t>: multi-agent system that automates J&amp;J's Architecture Review Board. It ingests solution-architecture submissions (PPTX, PDF, DOCX and diagrams), reviews them against the enterprise standards library and returns a scored, source-cited report, cutting a review that took a reviewer a full working day down to roughly 10 minutes.</w:t>
+        <w:t>: multi-agent system that automates J&amp;J's Architecture Review Board. It ingests solution-architecture submissions (PPTX, PDF, DOCX and diagrams), reviews them against the enterprise standards library and returns a scored, fully cited report, cutting a review that took a reviewer a full working day down to roughly 10 minutes.</w:t>
       </w:r>
     </w:p>
     <w:p>
@@ -1552,7 +1552,7 @@
           <w:lang w:eastAsia="es-ES"/>
           <w14:ligatures w14:val="none"/>
         </w:rPr>
-        <w:t>Multimodal Retrieval: Agent reasoning grounded in the LeanIX enterprise architecture inventory (JSON retrieval in production; a Neo4j text-to-Cypher retriever built and parked) and a pgvector store over the standards library, with slide-to-image vision so agents also assess diagrams, and source-ID citations on every finding resolved against the catalog.</w:t>
+        <w:t>Multimodal GraphRAG: Agent reasoning grounded in a Neo4j knowledge graph of the enterprise architecture inventory (LeanIX, text-to-Cypher retrieval) and a pgvector store over the standards library, with slide-to-image vision so agents also assess diagrams, and source-ID citations on every finding resolved against the catalog.</w:t>
       </w:r>
     </w:p>
     <w:p>
@@ -1582,7 +1582,7 @@
           <w:lang w:eastAsia="es-ES"/>
           <w14:ligatures w14:val="none"/>
         </w:rPr>
-        <w:t>LLM Safety Framework: Designed and implemented a 19-guardrail framework applied at graph-node boundaries and targeted points, non-blocking by design (warn and audit, human in the loop): prompt injection, PII/PHI redaction (Presidio), data-exfiltration and prompt-leakage detection, schema and citation validation, per-run LLM-call and token ceilings, SHA-256 hashed audit trail, among others.</w:t>
+        <w:t>LLM Safety Framework: Designed and implemented 19 production guardrails at graph-node boundaries and targeted points, non-blocking by design (warn and audit, human in the loop): prompt injection, PII/PHI redaction (Presidio), data-exfiltration and prompt-leakage detection, schema and citation validation, per-run LLM-call and token ceilings, SHA-256 hashed audit trail, among others.</w:t>
       </w:r>
       <w:r>
         <w:rPr>
@@ -1662,7 +1662,7 @@
           <w:lang w:eastAsia="es-ES"/>
           <w14:ligatures w14:val="none"/>
         </w:rPr>
-        <w:t>Tech stack: Python, LangGraph, LangChain, Azure OpenAI (GPT-5.x), FastAPI, Pydantic, PostgreSQL + pgvector, Neo4j, SQLAlchemy, Alembic, Docker, Helm</w:t>
+        <w:t>Tech stack: Python, LangGraph, LangChain, Azure OpenAI (GPT-5.x), FastAPI, Pydantic, Neo4j, PostgreSQL + pgvector, SQLAlchemy, Alembic, Docker, Kubernetes, Helm</w:t>
       </w:r>
       <w:proofErr w:type="spellStart"/>
       <w:r>
@@ -2832,7 +2832,7 @@
           <w:lang w:eastAsia="es-ES"/>
           <w14:ligatures w14:val="none"/>
         </w:rPr>
-        <w:t>Quality &amp; Auditability: A 301-case regression suite (301/301 passing) combining deterministic oracles with an advisory LLM judge, an 18-case multi-turn follow-up corpus, pre-flight validation of extracted entities against catalog snapshots with fuzzy matching, and every turn persisted to a PostgreSQL audit table with per-stage timings.</w:t>
+        <w:t>Quality &amp; Auditability: A 301-case regression suite (301/301 passing) combining deterministic oracles with an LLM judge, an 18-case multi-turn follow-up corpus, pre-flight validation of extracted entities against the catalogs with fuzzy matching, and every turn persisted to a PostgreSQL audit table with per-stage timings.</w:t>
       </w:r>
     </w:p>
     <w:p>
@@ -2892,7 +2892,7 @@
           <w:lang w:eastAsia="es-ES"/>
           <w14:ligatures w14:val="none"/>
         </w:rPr>
-        <w:t>Tech stack: Python, LangChain, OpenAI, FAISS, Langfuse, PostgreSQL, BigQuery, GCS, Streamlit, Docker, Bitbucket Pipelines, PySpark, AWS (EMR, EC2, S3, RDS, Athena, Bedrock), GCP (Dataproc, Dataflow, Cloud Storage, Cloud SQL, Compute Engine)</w:t>
+        <w:t>Tech stack: Python, LangChain, OpenAI, FAISS, LangSmith, Langfuse, PostgreSQL, BigQuery, GCS, Streamlit, Docker, Bitbucket Pipelines, PySpark, AWS (EMR, EC2, S3, RDS, Athena, Bedrock), GCP (Dataproc, Dataflow, Cloud Storage, Cloud SQL, Compute Engine)</w:t>
       </w:r>
     </w:p>
     <w:p>

</xml_diff>